<commit_message>
Drop stray institutional CJK (target-responsibility) from response letter
Co-Authored-By: Claude Opus 4.8 (1M context) <noreply@anthropic.com>
</commit_message>
<xml_diff>
--- a/06-submission/response-to-reviewers-R2.docx
+++ b/06-submission/response-to-reviewers-R2.docx
@@ -991,22 +991,7 @@
           <w:b/>
           <w:bCs/>
         </w:rPr>
-        <w:t xml:space="preserve">target-responsibility </w:t>
-      </w:r>
-      <w:r>
-        <w:rPr>
-          <w:rFonts w:hint="eastAsia"/>
-          <w:b/>
-          <w:bCs/>
-        </w:rPr>
-        <w:t xml:space="preserve">(目标责任制)</w:t>
-      </w:r>
-      <w:r>
-        <w:rPr>
-          <w:b/>
-          <w:bCs/>
-        </w:rPr>
-        <w:t xml:space="preserve"> cadre-evaluation</w:t>
+        <w:t xml:space="preserve">target-responsibility cadre-evaluation</w:t>
       </w:r>
       <w:r>
         <w:t xml:space="preserve"> </w:t>

</xml_diff>

<commit_message>
De-AI response letter (cut prose em-dashes; facts/table preserved)
Co-Authored-By: Claude Opus 4.8 (1M context) <noreply@anthropic.com>
</commit_message>
<xml_diff>
--- a/06-submission/response-to-reviewers-R2.docx
+++ b/06-submission/response-to-reviewers-R2.docx
@@ -81,7 +81,7 @@
         <w:pStyle w:val="BodyText"/>
       </w:pPr>
       <w:r>
-        <w:t xml:space="preserve">We thank you for an exceptionally constructive review. Your central diagnosis — that the manuscript measured visible-infrastructure</w:t>
+        <w:t xml:space="preserve">We thank you for an exceptionally constructive review. Your central diagnosis was correct: the manuscript measured visible-infrastructure</w:t>
       </w:r>
       <w:r>
         <w:t xml:space="preserve"> </w:t>
@@ -110,36 +110,7 @@
         <w:t xml:space="preserve">visibility bias</w:t>
       </w:r>
       <w:r>
-        <w:t xml:space="preserve">, and overclaimed beyond its evidence — was correct. We have</w:t>
-      </w:r>
-      <w:r>
-        <w:t xml:space="preserve"> </w:t>
-      </w:r>
-      <w:r>
-        <w:rPr>
-          <w:b/>
-          <w:bCs/>
-        </w:rPr>
-        <w:t xml:space="preserve">kept the Visibility Attention Index (VAI) as the paper’s instrument and kept the paper’s structure</w:t>
-      </w:r>
-      <w:r>
-        <w:t xml:space="preserve">, and used your comments to</w:t>
-      </w:r>
-      <w:r>
-        <w:t xml:space="preserve"> </w:t>
-      </w:r>
-      <w:r>
-        <w:rPr>
-          <w:b/>
-          <w:bCs/>
-        </w:rPr>
-        <w:t xml:space="preserve">substantially strengthen the validation and narrow the claims</w:t>
-      </w:r>
-      <w:r>
-        <w:t xml:space="preserve"> </w:t>
-      </w:r>
-      <w:r>
-        <w:t xml:space="preserve">along four lines:</w:t>
+        <w:t xml:space="preserve">, and overclaimed beyond its evidence. We have kept the Visibility Attention Index (VAI) as the paper’s instrument and kept the paper’s structure, and used your comments to substantially strengthen the validation and narrow the claims along four lines:</w:t>
       </w:r>
     </w:p>
     <w:p>
@@ -161,7 +132,7 @@
         <w:t xml:space="preserve"> </w:t>
       </w:r>
       <w:r>
-        <w:t xml:space="preserve">(human double-coding + a three-model LLM ensemble) that honestly maps what the visibility dictionary can and cannot measure — including a</w:t>
+        <w:t xml:space="preserve">(human double-coding plus a three-model LLM ensemble) that honestly maps what the visibility dictionary can and cannot measure, including a</w:t>
       </w:r>
       <w:r>
         <w:t xml:space="preserve"> </w:t>
@@ -218,10 +189,7 @@
         <w:t xml:space="preserve">Behavioral (criterion) validity</w:t>
       </w:r>
       <w:r>
-        <w:t xml:space="preserve"> </w:t>
-      </w:r>
-      <w:r>
-        <w:t xml:space="preserve">— the decisive answer to the rhetoric-vs-strategy question: under a quasi-exogenous incentive shock, the</w:t>
+        <w:t xml:space="preserve">, which answers the rhetoric-vs-strategy question: under a quasi-exogenous incentive shock, the</w:t>
       </w:r>
       <w:r>
         <w:t xml:space="preserve"> </w:t>
@@ -275,7 +243,7 @@
         <w:t xml:space="preserve"> </w:t>
       </w:r>
       <w:r>
-        <w:t xml:space="preserve">of the under-identified causal and welfare exercises, and narrowing of the claims to what the evidence supports (§4.4–§4.5).</w:t>
+        <w:t xml:space="preserve">of the under-identified causal and welfare exercises, with the claims narrowed to what the evidence supports (§4.4–§4.5).</w:t>
       </w:r>
     </w:p>
     <w:p>
@@ -283,7 +251,7 @@
         <w:pStyle w:val="FirstParagraph"/>
       </w:pPr>
       <w:r>
-        <w:t xml:space="preserve">The paper a reviewer reads is the same paper, with much stronger validation — not a different one.</w:t>
+        <w:t xml:space="preserve">The paper a reviewer reads is the same paper. It now carries much stronger validation.</w:t>
       </w:r>
     </w:p>
     <w:bookmarkStart w:id="9" w:name="a-note-on-the-author-team"/>
@@ -322,7 +290,7 @@
         <w:t xml:space="preserve"> </w:t>
       </w:r>
       <w:r>
-        <w:t xml:space="preserve">(co-first author; urban &amp; rural planning) constructed and verified the visible-versus-functional classification behind the new procurement evidence (§4.3) — domain judgment a keyword scheme alone cannot supply.</w:t>
+        <w:t xml:space="preserve">(co-first author; urban &amp; rural planning) constructed and verified the visible-versus-functional classification behind the new procurement evidence (§4.3); domain judgment a keyword scheme alone cannot supply.</w:t>
       </w:r>
     </w:p>
     <w:p>
@@ -384,7 +352,7 @@
         <w:t xml:space="preserve"> </w:t>
       </w:r>
       <w:r>
-        <w:t xml:space="preserve">the procurement-lexicon adjudication, which the domain-expert coauthor then signed off — a workflow consistent with the paper’s own thesis about combining dictionaries, LLMs, and human validation. Section numbers below refer to the revised manuscript.</w:t>
+        <w:t xml:space="preserve">the procurement-lexicon adjudication, which the domain-expert coauthor then signed off, a workflow consistent with the paper’s own thesis about combining dictionaries, LLMs, and human validation. Section numbers below refer to the revised manuscript.</w:t>
       </w:r>
     </w:p>
     <w:p>
@@ -546,10 +514,7 @@
         <w:t xml:space="preserve">metro/rail</w:t>
       </w:r>
       <w:r>
-        <w:t xml:space="preserve"> </w:t>
-      </w:r>
-      <w:r>
-        <w:t xml:space="preserve">— physically underground yet a daily-used, media-celebrated prestige achievement, hence maximally salient and coded</w:t>
+        <w:t xml:space="preserve">: physically underground yet a daily-used, media-celebrated prestige achievement, hence maximally salient and coded</w:t>
       </w:r>
       <w:r>
         <w:t xml:space="preserve"> </w:t>
@@ -887,7 +852,7 @@
         <w:t xml:space="preserve">what is emphasized</w:t>
       </w:r>
       <w:r>
-        <w:t xml:space="preserve">, with the strategic interpretation resting on this co-movement — the cautious framing you requested.</w:t>
+        <w:t xml:space="preserve">, with the strategic interpretation resting on this co-movement, the cautious framing you requested.</w:t>
       </w:r>
     </w:p>
     <w:bookmarkEnd w:id="10"/>
@@ -1006,10 +971,7 @@
         <w:t xml:space="preserve">explicit</w:t>
       </w:r>
       <w:r>
-        <w:t xml:space="preserve"> </w:t>
-      </w:r>
-      <w:r>
-        <w:t xml:space="preserve">— the salience criterion is defined relative to the</w:t>
+        <w:t xml:space="preserve">: the salience criterion is defined relative to the</w:t>
       </w:r>
       <w:r>
         <w:t xml:space="preserve"> </w:t>
@@ -1025,7 +987,7 @@
         <w:t xml:space="preserve"> </w:t>
       </w:r>
       <w:r>
-        <w:t xml:space="preserve">principal — and report the citizen channel as a bounded null (§4.5), not the asserted mechanism.</w:t>
+        <w:t xml:space="preserve">principal, and report the citizen channel as a bounded null (§4.5), not the asserted mechanism.</w:t>
       </w:r>
     </w:p>
     <w:bookmarkEnd w:id="11"/>
@@ -1053,7 +1015,7 @@
         <w:t xml:space="preserve"> </w:t>
       </w:r>
       <w:r>
-        <w:t xml:space="preserve">We relabel the earlier checks for exactly what they establish — the alternative-dictionary correlation as</w:t>
+        <w:t xml:space="preserve">We relabel the earlier checks for exactly what they establish: the alternative-dictionary correlation as</w:t>
       </w:r>
       <w:r>
         <w:t xml:space="preserve"> </w:t>
@@ -1381,7 +1343,7 @@
         <w:t xml:space="preserve"> </w:t>
       </w:r>
       <w:r>
-        <w:t xml:space="preserve">(substantial); residual disagreement concentrates on the visible-vs-mixed boundary — itself a manifestation of the polysemy we document.</w:t>
+        <w:t xml:space="preserve">(substantial); residual disagreement concentrates on the visible-vs-mixed boundary, itself a manifestation of the polysemy we document.</w:t>
       </w:r>
     </w:p>
     <w:bookmarkEnd w:id="12"/>
@@ -1647,7 +1609,7 @@
         <w:t xml:space="preserve"> </w:t>
       </w:r>
       <w:r>
-        <w:t xml:space="preserve">(99th percentile ¥0.90B vs ¥0.20B; maximum ¥11.5B, the Hangzhou Metro Line 7 contract) — addressing your concern that project counts are confounded by packaging.</w:t>
+        <w:t xml:space="preserve">(99th percentile ¥0.90B vs ¥0.20B; maximum ¥11.5B, the Hangzhou Metro Line 7 contract), addressing your concern that project counts are confounded by packaging.</w:t>
       </w:r>
     </w:p>
     <w:p>
@@ -2016,7 +1978,7 @@
         <w:pStyle w:val="BodyText"/>
       </w:pPr>
       <w:r>
-        <w:t xml:space="preserve">The paper is now narrower and substantially better-evidenced: it honestly delimits the dictionary, offers a high-precision LLM alternative, establishes the construct’s reality in behavior, and adds large-scale procurement corroboration — all on the structure you reviewed. We are grateful for guidance that materially improved the work.</w:t>
+        <w:t xml:space="preserve">The paper is now narrower and substantially better-evidenced: it honestly delimits the dictionary, offers a high-precision LLM alternative, establishes the construct’s reality in behavior, and adds large-scale procurement corroboration, all on the structure you reviewed. We are grateful for guidance that materially improved the work.</w:t>
       </w:r>
     </w:p>
     <w:p>

</xml_diff>